<commit_message>
Uploaded the latest windows form application v1.3; Upload the latest documentation; Also uploaded the Customized Arduino code of the firmware - under development.
</commit_message>
<xml_diff>
--- a/Software/Documentation/Windows Form Application/part_2.docx
+++ b/Software/Documentation/Windows Form Application/part_2.docx
@@ -2436,18 +2436,1581 @@
           <w:szCs w:val="32"/>
           <w:lang w:val="en-AE"/>
         </w:rPr>
-        <w:t>SYSTEM DESIGN</w:t>
-      </w:r>
-    </w:p>
-    <w:p>
-      <w:pPr>
-        <w:spacing w:after="200" w:line="276" w:lineRule="auto"/>
-        <w:ind w:left="0" w:firstLine="0"/>
+        <w:t>SYSTEM IMPLEMENTATION</w:t>
+      </w:r>
+    </w:p>
+    <w:p>
+      <w:pPr>
+        <w:spacing w:after="200" w:line="276" w:lineRule="auto"/>
+        <w:ind w:left="0" w:firstLine="0"/>
+      </w:pPr>
+    </w:p>
+    <w:p>
+      <w:pPr>
+        <w:pStyle w:val="ListParagraph"/>
+        <w:numPr>
+          <w:ilvl w:val="1"/>
+          <w:numId w:val="27"/>
+        </w:numPr>
+        <w:spacing w:after="200" w:line="276" w:lineRule="auto"/>
+        <w:rPr>
+          <w:b/>
+          <w:bCs/>
+          <w:sz w:val="32"/>
+          <w:szCs w:val="28"/>
+          <w:lang w:val="en-AE"/>
+        </w:rPr>
+      </w:pPr>
+      <w:r>
+        <w:rPr>
+          <w:b/>
+          <w:bCs/>
+          <w:sz w:val="32"/>
+          <w:szCs w:val="28"/>
+          <w:lang w:val="en-AE"/>
+        </w:rPr>
+        <w:t>MAIN WINDOW INTERFACE</w:t>
+      </w:r>
+    </w:p>
+    <w:p>
+      <w:pPr>
+        <w:spacing w:after="200" w:line="276" w:lineRule="auto"/>
+        <w:ind w:left="0" w:firstLine="0"/>
+        <w:rPr>
+          <w:lang w:val="en-AE"/>
+        </w:rPr>
+      </w:pPr>
+      <w:r>
+        <w:rPr>
+          <w:lang w:val="en-AE"/>
+        </w:rPr>
+        <w:t>The main application window uses a familiar three</w:t>
+      </w:r>
+      <w:r>
+        <w:rPr>
+          <w:lang w:val="en-AE"/>
+        </w:rPr>
+        <w:noBreakHyphen/>
+        <w:t>area layout. At the top sits a menu strip, on the left a vertical stack of buttons, and the centre is a large panel where the active module appears. When the program starts, the central area shows the company logo. All navigation buttons are greyed out until the user logs in, keeping the protected features inaccessible to unauthorised persons. The window can be resized, and the layout adapts because the panels use docking and anchoring properties.</w:t>
+      </w:r>
+    </w:p>
+    <w:p>
+      <w:pPr>
+        <w:spacing w:after="200" w:line="276" w:lineRule="auto"/>
+        <w:ind w:left="0" w:firstLine="0"/>
+        <w:rPr>
+          <w:lang w:val="en-AE"/>
+        </w:rPr>
+      </w:pPr>
+      <w:r>
+        <w:rPr>
+          <w:lang w:val="en-AE"/>
+        </w:rPr>
+        <w:drawing>
+          <wp:inline distT="0" distB="0" distL="0" distR="0" wp14:anchorId="071CC1E0" wp14:editId="267C0830">
+            <wp:extent cx="5731510" cy="3460750"/>
+            <wp:effectExtent l="0" t="0" r="2540" b="6350"/>
+            <wp:docPr id="665243062" name="Picture 1"/>
+            <wp:cNvGraphicFramePr>
+              <a:graphicFrameLocks xmlns:a="http://schemas.openxmlformats.org/drawingml/2006/main" noChangeAspect="1"/>
+            </wp:cNvGraphicFramePr>
+            <a:graphic xmlns:a="http://schemas.openxmlformats.org/drawingml/2006/main">
+              <a:graphicData uri="http://schemas.openxmlformats.org/drawingml/2006/picture">
+                <pic:pic xmlns:pic="http://schemas.openxmlformats.org/drawingml/2006/picture">
+                  <pic:nvPicPr>
+                    <pic:cNvPr id="665243062" name=""/>
+                    <pic:cNvPicPr/>
+                  </pic:nvPicPr>
+                  <pic:blipFill>
+                    <a:blip r:embed="rId13"/>
+                    <a:stretch>
+                      <a:fillRect/>
+                    </a:stretch>
+                  </pic:blipFill>
+                  <pic:spPr>
+                    <a:xfrm>
+                      <a:off x="0" y="0"/>
+                      <a:ext cx="5731510" cy="3460750"/>
+                    </a:xfrm>
+                    <a:prstGeom prst="rect">
+                      <a:avLst/>
+                    </a:prstGeom>
+                  </pic:spPr>
+                </pic:pic>
+              </a:graphicData>
+            </a:graphic>
+          </wp:inline>
+        </w:drawing>
+      </w:r>
+    </w:p>
+    <w:p>
+      <w:pPr>
+        <w:spacing w:after="200" w:line="276" w:lineRule="auto"/>
+        <w:ind w:left="0" w:firstLine="0"/>
+        <w:jc w:val="center"/>
+        <w:rPr>
+          <w:b/>
+          <w:bCs/>
+        </w:rPr>
+      </w:pPr>
+      <w:r>
+        <w:rPr>
+          <w:b/>
+          <w:bCs/>
+        </w:rPr>
+        <w:t xml:space="preserve">Figure </w:t>
+      </w:r>
+      <w:r>
+        <w:rPr>
+          <w:b/>
+          <w:bCs/>
+        </w:rPr>
+        <w:t>4</w:t>
+      </w:r>
+      <w:r>
+        <w:rPr>
+          <w:b/>
+          <w:bCs/>
+        </w:rPr>
+        <w:t>.</w:t>
+      </w:r>
+      <w:r>
+        <w:rPr>
+          <w:b/>
+          <w:bCs/>
+        </w:rPr>
+        <w:t>1</w:t>
+      </w:r>
+      <w:r>
+        <w:rPr>
+          <w:b/>
+          <w:bCs/>
+        </w:rPr>
+        <w:t xml:space="preserve">: </w:t>
+      </w:r>
+      <w:r>
+        <w:rPr>
+          <w:b/>
+          <w:bCs/>
+        </w:rPr>
+        <w:t>Main Windows</w:t>
+      </w:r>
+      <w:r>
+        <w:rPr>
+          <w:b/>
+          <w:bCs/>
+        </w:rPr>
+        <w:t xml:space="preserve"> </w:t>
+      </w:r>
+      <w:r>
+        <w:rPr>
+          <w:b/>
+          <w:bCs/>
+        </w:rPr>
+        <w:t>Form.</w:t>
+      </w:r>
+    </w:p>
+    <w:p>
+      <w:pPr>
+        <w:spacing w:after="200" w:line="276" w:lineRule="auto"/>
+        <w:ind w:left="0" w:firstLine="0"/>
+        <w:jc w:val="center"/>
+        <w:rPr>
+          <w:b/>
+          <w:bCs/>
+        </w:rPr>
+      </w:pPr>
+    </w:p>
+    <w:p>
+      <w:pPr>
+        <w:pStyle w:val="ListParagraph"/>
+        <w:numPr>
+          <w:ilvl w:val="2"/>
+          <w:numId w:val="27"/>
+        </w:numPr>
+        <w:spacing w:after="200" w:line="276" w:lineRule="auto"/>
+        <w:rPr>
+          <w:b/>
+          <w:bCs/>
+          <w:sz w:val="28"/>
+          <w:szCs w:val="24"/>
+          <w:lang w:val="en-AE"/>
+        </w:rPr>
+      </w:pPr>
+      <w:r>
+        <w:rPr>
+          <w:b/>
+          <w:bCs/>
+          <w:sz w:val="28"/>
+          <w:szCs w:val="24"/>
+          <w:lang w:val="en-AE"/>
+        </w:rPr>
+        <w:t>Menu Strip (Top Navigation Bar)</w:t>
+      </w:r>
+    </w:p>
+    <w:p>
+      <w:pPr>
+        <w:spacing w:after="200" w:line="276" w:lineRule="auto"/>
+        <w:ind w:left="0" w:firstLine="0"/>
+        <w:rPr>
+          <w:lang w:val="en-AE"/>
+        </w:rPr>
+      </w:pPr>
+      <w:r>
+        <w:rPr>
+          <w:lang w:val="en-AE"/>
+        </w:rPr>
+        <w:t>The menu strip at the top provides quick access to global commands. It contains four main menus: </w:t>
+      </w:r>
+      <w:r>
+        <w:rPr>
+          <w:b/>
+          <w:bCs/>
+          <w:lang w:val="en-AE"/>
+        </w:rPr>
+        <w:t>File</w:t>
+      </w:r>
+      <w:r>
+        <w:rPr>
+          <w:lang w:val="en-AE"/>
+        </w:rPr>
+        <w:t>, </w:t>
+      </w:r>
+      <w:r>
+        <w:rPr>
+          <w:b/>
+          <w:bCs/>
+          <w:lang w:val="en-AE"/>
+        </w:rPr>
+        <w:t>Login</w:t>
+      </w:r>
+      <w:r>
+        <w:rPr>
+          <w:lang w:val="en-AE"/>
+        </w:rPr>
+        <w:t>, </w:t>
+      </w:r>
+      <w:r>
+        <w:rPr>
+          <w:b/>
+          <w:bCs/>
+          <w:lang w:val="en-AE"/>
+        </w:rPr>
+        <w:t>Help</w:t>
+      </w:r>
+      <w:r>
+        <w:rPr>
+          <w:lang w:val="en-AE"/>
+        </w:rPr>
+        <w:t>, and </w:t>
+      </w:r>
+      <w:r>
+        <w:rPr>
+          <w:b/>
+          <w:bCs/>
+          <w:lang w:val="en-AE"/>
+        </w:rPr>
+        <w:t>Data Transfer</w:t>
+      </w:r>
+      <w:r>
+        <w:rPr>
+          <w:lang w:val="en-AE"/>
+        </w:rPr>
+        <w:t xml:space="preserve">. The File menu lets the user create a new specification file, open an existing PDF, save, or print. The Login menu changes its text depending on the login state – it reads “Login” when nobody is signed in, and “Logout” when a user is already authenticated. The Help menu offers a User Manual that opens a PDF file and an About box that shows the program’s version. The Data Transfer menu is reserved for future </w:t>
+      </w:r>
+      <w:r>
+        <w:rPr>
+          <w:lang w:val="en-AE"/>
+        </w:rPr>
+        <w:lastRenderedPageBreak/>
+        <w:t>upload and download features. At the far right of the menu strip, a small icon and a label display the current user’s name once logged in, otherwise it shows “Not Logged In”.</w:t>
+      </w:r>
+    </w:p>
+    <w:p>
+      <w:pPr>
+        <w:pStyle w:val="ListParagraph"/>
+        <w:numPr>
+          <w:ilvl w:val="2"/>
+          <w:numId w:val="27"/>
+        </w:numPr>
+        <w:spacing w:after="200" w:line="276" w:lineRule="auto"/>
+        <w:rPr>
+          <w:b/>
+          <w:bCs/>
+          <w:sz w:val="28"/>
+          <w:szCs w:val="24"/>
+          <w:lang w:val="en-AE"/>
+        </w:rPr>
+      </w:pPr>
+      <w:r>
+        <w:rPr>
+          <w:b/>
+          <w:bCs/>
+          <w:sz w:val="28"/>
+          <w:szCs w:val="24"/>
+          <w:lang w:val="en-AE"/>
+        </w:rPr>
+        <w:t>Left Navigation Panel</w:t>
+      </w:r>
+    </w:p>
+    <w:p>
+      <w:pPr>
+        <w:spacing w:after="200" w:line="276" w:lineRule="auto"/>
+        <w:ind w:left="0" w:firstLine="0"/>
+        <w:rPr>
+          <w:lang w:val="en-AE"/>
+        </w:rPr>
+      </w:pPr>
+      <w:r>
+        <w:rPr>
+          <w:lang w:val="en-AE"/>
+        </w:rPr>
+        <w:t>The left panel is a vertical strip of buttons, each labelled after a main function. The buttons are: Home, Node, Area, Tests, Settings, Network, I/O Activity, Upload/Download, and Panel Settings. Clicking a button changes the centre panel to the matching module. The Home button returns the central area to the company logo. All buttons are disabled until a successful login, ensuring that nobody can access the modules without permission. This panel remains visible at all times, giving constant quick access to every part of the program.</w:t>
+      </w:r>
+    </w:p>
+    <w:p>
+      <w:pPr>
+        <w:spacing w:after="200" w:line="276" w:lineRule="auto"/>
+        <w:ind w:left="0" w:firstLine="0"/>
+        <w:rPr>
+          <w:lang w:val="en-AE"/>
+        </w:rPr>
+      </w:pPr>
+    </w:p>
+    <w:p>
+      <w:pPr>
+        <w:pStyle w:val="ListParagraph"/>
+        <w:numPr>
+          <w:ilvl w:val="1"/>
+          <w:numId w:val="27"/>
+        </w:numPr>
+        <w:spacing w:after="200" w:line="276" w:lineRule="auto"/>
+        <w:rPr>
+          <w:b/>
+          <w:bCs/>
+          <w:sz w:val="32"/>
+          <w:szCs w:val="28"/>
+          <w:lang w:val="en-AE"/>
+        </w:rPr>
+      </w:pPr>
+      <w:r>
+        <w:rPr>
+          <w:b/>
+          <w:bCs/>
+          <w:sz w:val="32"/>
+          <w:szCs w:val="28"/>
+          <w:lang w:val="en-AE"/>
+        </w:rPr>
+        <w:t>AUTHENTICATION MODULE</w:t>
+      </w:r>
+    </w:p>
+    <w:p>
+      <w:pPr>
+        <w:spacing w:after="200" w:line="276" w:lineRule="auto"/>
+        <w:ind w:left="0" w:firstLine="0"/>
+        <w:rPr>
+          <w:lang w:val="en-AE"/>
+        </w:rPr>
+      </w:pPr>
+      <w:r>
+        <w:rPr>
+          <w:lang w:val="en-AE"/>
+        </w:rPr>
+        <w:t>The login dialog appears when the user clicks the Login menu item. It is a small, fixed</w:t>
+      </w:r>
+      <w:r>
+        <w:rPr>
+          <w:lang w:val="en-AE"/>
+        </w:rPr>
+        <w:noBreakHyphen/>
+        <w:t>size window with two text fields (username and password), a Login button, and a Cancel button. The password is hidden as asterisks while typing. When the user presses Login, the program scrambles the password with a one</w:t>
+      </w:r>
+      <w:r>
+        <w:rPr>
+          <w:lang w:val="en-AE"/>
+        </w:rPr>
+        <w:noBreakHyphen/>
+        <w:t>way hash and compares it against the database. If the credentials match, the dialog closes, the main window becomes fully active, the left panel buttons light up, the Login menu changes to Logout, and the user’s full name appears at the top right. If the login fails, an error message is shown and the dialog stays open. Two accounts exist by default: an administrator (“admin”) and a standard operator (“Rakesh S”). The administrator can access extra features, such as calibration controls, that remain hidden from other users.</w:t>
+      </w:r>
+    </w:p>
+    <w:p>
+      <w:pPr>
+        <w:spacing w:after="200" w:line="276" w:lineRule="auto"/>
+        <w:ind w:left="0" w:firstLine="0"/>
+        <w:rPr>
+          <w:lang w:val="en-AE"/>
+        </w:rPr>
+      </w:pPr>
+      <w:r>
+        <w:rPr>
+          <w:lang w:val="en-AE"/>
+        </w:rPr>
+        <w:drawing>
+          <wp:inline distT="0" distB="0" distL="0" distR="0" wp14:anchorId="0FD62833" wp14:editId="3942F741">
+            <wp:extent cx="5676900" cy="3420228"/>
+            <wp:effectExtent l="0" t="0" r="0" b="8890"/>
+            <wp:docPr id="1561023602" name="Picture 1"/>
+            <wp:cNvGraphicFramePr>
+              <a:graphicFrameLocks xmlns:a="http://schemas.openxmlformats.org/drawingml/2006/main" noChangeAspect="1"/>
+            </wp:cNvGraphicFramePr>
+            <a:graphic xmlns:a="http://schemas.openxmlformats.org/drawingml/2006/main">
+              <a:graphicData uri="http://schemas.openxmlformats.org/drawingml/2006/picture">
+                <pic:pic xmlns:pic="http://schemas.openxmlformats.org/drawingml/2006/picture">
+                  <pic:nvPicPr>
+                    <pic:cNvPr id="1561023602" name=""/>
+                    <pic:cNvPicPr/>
+                  </pic:nvPicPr>
+                  <pic:blipFill>
+                    <a:blip r:embed="rId14"/>
+                    <a:stretch>
+                      <a:fillRect/>
+                    </a:stretch>
+                  </pic:blipFill>
+                  <pic:spPr>
+                    <a:xfrm>
+                      <a:off x="0" y="0"/>
+                      <a:ext cx="5681392" cy="3422934"/>
+                    </a:xfrm>
+                    <a:prstGeom prst="rect">
+                      <a:avLst/>
+                    </a:prstGeom>
+                  </pic:spPr>
+                </pic:pic>
+              </a:graphicData>
+            </a:graphic>
+          </wp:inline>
+        </w:drawing>
+      </w:r>
+    </w:p>
+    <w:p>
+      <w:pPr>
+        <w:spacing w:after="200" w:line="276" w:lineRule="auto"/>
+        <w:ind w:left="0" w:firstLine="0"/>
+        <w:jc w:val="center"/>
+        <w:rPr>
+          <w:b/>
+          <w:bCs/>
+        </w:rPr>
+      </w:pPr>
+      <w:r>
+        <w:rPr>
+          <w:b/>
+          <w:bCs/>
+        </w:rPr>
+        <w:t xml:space="preserve">Figure </w:t>
+      </w:r>
+      <w:r>
+        <w:rPr>
+          <w:b/>
+          <w:bCs/>
+        </w:rPr>
+        <w:t>4</w:t>
+      </w:r>
+      <w:r>
+        <w:rPr>
+          <w:b/>
+          <w:bCs/>
+        </w:rPr>
+        <w:t>.</w:t>
+      </w:r>
+      <w:r>
+        <w:rPr>
+          <w:b/>
+          <w:bCs/>
+        </w:rPr>
+        <w:t>2</w:t>
+      </w:r>
+      <w:r>
+        <w:rPr>
+          <w:b/>
+          <w:bCs/>
+        </w:rPr>
+        <w:t xml:space="preserve">: </w:t>
+      </w:r>
+      <w:r>
+        <w:rPr>
+          <w:b/>
+          <w:bCs/>
+        </w:rPr>
+        <w:t>Login Form.</w:t>
+      </w:r>
+    </w:p>
+    <w:p>
+      <w:pPr>
+        <w:pStyle w:val="ListParagraph"/>
+        <w:numPr>
+          <w:ilvl w:val="1"/>
+          <w:numId w:val="27"/>
+        </w:numPr>
+        <w:spacing w:after="200" w:line="276" w:lineRule="auto"/>
+        <w:rPr>
+          <w:b/>
+          <w:bCs/>
+          <w:sz w:val="32"/>
+          <w:szCs w:val="28"/>
+          <w:lang w:val="en-AE"/>
+        </w:rPr>
+      </w:pPr>
+      <w:r>
+        <w:rPr>
+          <w:b/>
+          <w:bCs/>
+          <w:sz w:val="32"/>
+          <w:szCs w:val="28"/>
+          <w:lang w:val="en-AE"/>
+        </w:rPr>
+        <w:lastRenderedPageBreak/>
+        <w:t>NODE MANAGEMENT MODULE</w:t>
+      </w:r>
+    </w:p>
+    <w:p>
+      <w:pPr>
+        <w:spacing w:after="200" w:line="276" w:lineRule="auto"/>
+        <w:ind w:left="0" w:firstLine="0"/>
+        <w:rPr>
+          <w:lang w:val="en-AE"/>
+        </w:rPr>
+      </w:pPr>
+      <w:r>
+        <w:rPr>
+          <w:lang w:val="en-AE"/>
+        </w:rPr>
+        <w:t>The Node module is the place for managing device records. It contains a dropdown at the top for selecting a route (1 to 4), three buttons (Add, Edit, Delete), and a data grid that fills the rest of the area. The grid displays every node belonging to the selected route, showing the route number, IP address, panel location, description, a checkbox for calibration status, and the panel serial number. Clicking </w:t>
+      </w:r>
+      <w:r>
+        <w:rPr>
+          <w:b/>
+          <w:bCs/>
+          <w:lang w:val="en-AE"/>
+        </w:rPr>
+        <w:t>Add</w:t>
+      </w:r>
+      <w:r>
+        <w:rPr>
+          <w:lang w:val="en-AE"/>
+        </w:rPr>
+        <w:t> opens a new dialog where the user must enter a unique panel serial number, an IP address, and a panel location number, plus an optional description and calibration flag. The program checks that the IP address is valid, that it is not already used, that the panel location is free on the same route, and that the serial number is unique. If any check fails, an error message appears and the dialog remains open. </w:t>
+      </w:r>
+      <w:r>
+        <w:rPr>
+          <w:b/>
+          <w:bCs/>
+          <w:lang w:val="en-AE"/>
+        </w:rPr>
+        <w:t>Edit</w:t>
+      </w:r>
+      <w:r>
+        <w:rPr>
+          <w:lang w:val="en-AE"/>
+        </w:rPr>
+        <w:t> works the same way but pre</w:t>
+      </w:r>
+      <w:r>
+        <w:rPr>
+          <w:lang w:val="en-AE"/>
+        </w:rPr>
+        <w:noBreakHyphen/>
+        <w:t>fills the fields with the selected node’s current data. </w:t>
+      </w:r>
+      <w:r>
+        <w:rPr>
+          <w:b/>
+          <w:bCs/>
+          <w:lang w:val="en-AE"/>
+        </w:rPr>
+        <w:t>Delete</w:t>
+      </w:r>
+      <w:r>
+        <w:rPr>
+          <w:lang w:val="en-AE"/>
+        </w:rPr>
+        <w:t> asks for a confirmation before permanently removing the selected record. All data operations use safe, parameterised database queries.</w:t>
+      </w:r>
+    </w:p>
+    <w:p>
+      <w:pPr>
+        <w:spacing w:after="200" w:line="276" w:lineRule="auto"/>
+        <w:ind w:left="0" w:firstLine="0"/>
+        <w:rPr>
+          <w:lang w:val="en-AE"/>
+        </w:rPr>
+      </w:pPr>
+      <w:r>
+        <w:rPr>
+          <w:lang w:val="en-AE"/>
+        </w:rPr>
+        <w:drawing>
+          <wp:inline distT="0" distB="0" distL="0" distR="0" wp14:anchorId="5A84C8D1" wp14:editId="3E23BCB3">
+            <wp:extent cx="5731510" cy="3482340"/>
+            <wp:effectExtent l="0" t="0" r="2540" b="3810"/>
+            <wp:docPr id="918703213" name="Picture 1"/>
+            <wp:cNvGraphicFramePr>
+              <a:graphicFrameLocks xmlns:a="http://schemas.openxmlformats.org/drawingml/2006/main" noChangeAspect="1"/>
+            </wp:cNvGraphicFramePr>
+            <a:graphic xmlns:a="http://schemas.openxmlformats.org/drawingml/2006/main">
+              <a:graphicData uri="http://schemas.openxmlformats.org/drawingml/2006/picture">
+                <pic:pic xmlns:pic="http://schemas.openxmlformats.org/drawingml/2006/picture">
+                  <pic:nvPicPr>
+                    <pic:cNvPr id="918703213" name=""/>
+                    <pic:cNvPicPr/>
+                  </pic:nvPicPr>
+                  <pic:blipFill>
+                    <a:blip r:embed="rId15"/>
+                    <a:stretch>
+                      <a:fillRect/>
+                    </a:stretch>
+                  </pic:blipFill>
+                  <pic:spPr>
+                    <a:xfrm>
+                      <a:off x="0" y="0"/>
+                      <a:ext cx="5731510" cy="3482340"/>
+                    </a:xfrm>
+                    <a:prstGeom prst="rect">
+                      <a:avLst/>
+                    </a:prstGeom>
+                  </pic:spPr>
+                </pic:pic>
+              </a:graphicData>
+            </a:graphic>
+          </wp:inline>
+        </w:drawing>
+      </w:r>
+    </w:p>
+    <w:p>
+      <w:pPr>
+        <w:spacing w:after="200" w:line="276" w:lineRule="auto"/>
+        <w:ind w:left="0" w:firstLine="0"/>
+        <w:jc w:val="center"/>
+        <w:rPr>
+          <w:b/>
+          <w:bCs/>
+        </w:rPr>
+      </w:pPr>
+      <w:r>
+        <w:rPr>
+          <w:b/>
+          <w:bCs/>
+        </w:rPr>
+        <w:t xml:space="preserve">Figure </w:t>
+      </w:r>
+      <w:r>
+        <w:rPr>
+          <w:b/>
+          <w:bCs/>
+        </w:rPr>
+        <w:t>4</w:t>
+      </w:r>
+      <w:r>
+        <w:rPr>
+          <w:b/>
+          <w:bCs/>
+        </w:rPr>
+        <w:t>.</w:t>
+      </w:r>
+      <w:r>
+        <w:rPr>
+          <w:b/>
+          <w:bCs/>
+        </w:rPr>
+        <w:t>3</w:t>
+      </w:r>
+      <w:r>
+        <w:rPr>
+          <w:b/>
+          <w:bCs/>
+        </w:rPr>
+        <w:t xml:space="preserve">: </w:t>
+      </w:r>
+      <w:r>
+        <w:rPr>
+          <w:b/>
+          <w:bCs/>
+        </w:rPr>
+        <w:t>Node User Control.</w:t>
+      </w:r>
+    </w:p>
+    <w:p>
+      <w:pPr>
+        <w:spacing w:after="200" w:line="276" w:lineRule="auto"/>
+        <w:ind w:left="0" w:firstLine="0"/>
+        <w:jc w:val="center"/>
+        <w:rPr>
+          <w:b/>
+          <w:bCs/>
+        </w:rPr>
+      </w:pPr>
+    </w:p>
+    <w:p>
+      <w:pPr>
+        <w:pStyle w:val="ListParagraph"/>
+        <w:numPr>
+          <w:ilvl w:val="1"/>
+          <w:numId w:val="27"/>
+        </w:numPr>
+        <w:spacing w:after="200" w:line="276" w:lineRule="auto"/>
+        <w:rPr>
+          <w:b/>
+          <w:bCs/>
+          <w:sz w:val="32"/>
+          <w:szCs w:val="28"/>
+          <w:lang w:val="en-AE"/>
+        </w:rPr>
+      </w:pPr>
+      <w:r>
+        <w:rPr>
+          <w:b/>
+          <w:bCs/>
+          <w:sz w:val="32"/>
+          <w:szCs w:val="28"/>
+          <w:lang w:val="en-AE"/>
+        </w:rPr>
+        <w:t>AREA MANAGEMENT MODULE</w:t>
+      </w:r>
+    </w:p>
+    <w:p>
+      <w:pPr>
+        <w:spacing w:after="200" w:line="276" w:lineRule="auto"/>
+        <w:ind w:left="0" w:firstLine="0"/>
+        <w:rPr>
+          <w:lang w:val="en-AE"/>
+        </w:rPr>
+      </w:pPr>
+      <w:r>
+        <w:rPr>
+          <w:lang w:val="en-AE"/>
+        </w:rPr>
+        <w:t>The Area module helps technicians label the physical location of every panel slot. It displays a route dropdown and a data grid. When a route is picked, the grid shows all one hundred panel locations for that route, each with its panel number, the IP address of any node assigned there (or “Not Assigned” if vacant), and a description field. The description is initially empty. To add or change a description, the user selects a row and clicks the </w:t>
+      </w:r>
+      <w:r>
+        <w:rPr>
+          <w:b/>
+          <w:bCs/>
+          <w:lang w:val="en-AE"/>
+        </w:rPr>
+        <w:t>Edit</w:t>
+      </w:r>
+      <w:r>
+        <w:rPr>
+          <w:lang w:val="en-AE"/>
+        </w:rPr>
+        <w:t xml:space="preserve"> button. A small dialog opens showing the panel location number (which cannot be changed) and a text box for the </w:t>
+      </w:r>
+      <w:r>
+        <w:rPr>
+          <w:lang w:val="en-AE"/>
+        </w:rPr>
+        <w:lastRenderedPageBreak/>
+        <w:t>description. Saving updates the database. The grid itself cannot be directly edited; all changes go through the Edit dialog. The data is retrieved by combining the Areas table (which holds the descriptions) with the Nodes table (which holds the IP addresses) through a left</w:t>
+      </w:r>
+      <w:r>
+        <w:rPr>
+          <w:lang w:val="en-AE"/>
+        </w:rPr>
+        <w:noBreakHyphen/>
+        <w:t>join query.</w:t>
+      </w:r>
+    </w:p>
+    <w:p>
+      <w:pPr>
+        <w:spacing w:after="200" w:line="276" w:lineRule="auto"/>
+        <w:ind w:left="0" w:firstLine="0"/>
+        <w:rPr>
+          <w:lang w:val="en-AE"/>
+        </w:rPr>
+      </w:pPr>
+      <w:r>
+        <w:rPr>
+          <w:lang w:val="en-AE"/>
+        </w:rPr>
+        <w:drawing>
+          <wp:inline distT="0" distB="0" distL="0" distR="0" wp14:anchorId="5DD6167F" wp14:editId="30DEB22B">
+            <wp:extent cx="5731510" cy="3451225"/>
+            <wp:effectExtent l="0" t="0" r="2540" b="0"/>
+            <wp:docPr id="781925444" name="Picture 1"/>
+            <wp:cNvGraphicFramePr>
+              <a:graphicFrameLocks xmlns:a="http://schemas.openxmlformats.org/drawingml/2006/main" noChangeAspect="1"/>
+            </wp:cNvGraphicFramePr>
+            <a:graphic xmlns:a="http://schemas.openxmlformats.org/drawingml/2006/main">
+              <a:graphicData uri="http://schemas.openxmlformats.org/drawingml/2006/picture">
+                <pic:pic xmlns:pic="http://schemas.openxmlformats.org/drawingml/2006/picture">
+                  <pic:nvPicPr>
+                    <pic:cNvPr id="781925444" name=""/>
+                    <pic:cNvPicPr/>
+                  </pic:nvPicPr>
+                  <pic:blipFill>
+                    <a:blip r:embed="rId16"/>
+                    <a:stretch>
+                      <a:fillRect/>
+                    </a:stretch>
+                  </pic:blipFill>
+                  <pic:spPr>
+                    <a:xfrm>
+                      <a:off x="0" y="0"/>
+                      <a:ext cx="5731510" cy="3451225"/>
+                    </a:xfrm>
+                    <a:prstGeom prst="rect">
+                      <a:avLst/>
+                    </a:prstGeom>
+                  </pic:spPr>
+                </pic:pic>
+              </a:graphicData>
+            </a:graphic>
+          </wp:inline>
+        </w:drawing>
+      </w:r>
+    </w:p>
+    <w:p>
+      <w:pPr>
+        <w:spacing w:after="200" w:line="276" w:lineRule="auto"/>
+        <w:ind w:left="0" w:firstLine="0"/>
+        <w:jc w:val="center"/>
+        <w:rPr>
+          <w:b/>
+          <w:bCs/>
+        </w:rPr>
+      </w:pPr>
+      <w:r>
+        <w:rPr>
+          <w:b/>
+          <w:bCs/>
+        </w:rPr>
+        <w:t xml:space="preserve">Figure </w:t>
+      </w:r>
+      <w:r>
+        <w:rPr>
+          <w:b/>
+          <w:bCs/>
+        </w:rPr>
+        <w:t>4</w:t>
+      </w:r>
+      <w:r>
+        <w:rPr>
+          <w:b/>
+          <w:bCs/>
+        </w:rPr>
+        <w:t>.</w:t>
+      </w:r>
+      <w:r>
+        <w:rPr>
+          <w:b/>
+          <w:bCs/>
+        </w:rPr>
+        <w:t>4</w:t>
+      </w:r>
+      <w:r>
+        <w:rPr>
+          <w:b/>
+          <w:bCs/>
+        </w:rPr>
+        <w:t xml:space="preserve">: </w:t>
+      </w:r>
+      <w:r>
+        <w:rPr>
+          <w:b/>
+          <w:bCs/>
+        </w:rPr>
+        <w:t>Area User Control.</w:t>
+      </w:r>
+    </w:p>
+    <w:p>
+      <w:pPr>
+        <w:spacing w:after="200" w:line="276" w:lineRule="auto"/>
+        <w:ind w:left="0" w:firstLine="0"/>
+        <w:jc w:val="center"/>
+        <w:rPr>
+          <w:b/>
+          <w:bCs/>
+        </w:rPr>
+      </w:pPr>
+    </w:p>
+    <w:p>
+      <w:pPr>
+        <w:pStyle w:val="ListParagraph"/>
+        <w:numPr>
+          <w:ilvl w:val="1"/>
+          <w:numId w:val="27"/>
+        </w:numPr>
+        <w:spacing w:after="200" w:line="276" w:lineRule="auto"/>
+        <w:rPr>
+          <w:b/>
+          <w:bCs/>
+          <w:sz w:val="32"/>
+          <w:szCs w:val="28"/>
+          <w:lang w:val="en-AE"/>
+        </w:rPr>
+      </w:pPr>
+      <w:r>
+        <w:rPr>
+          <w:b/>
+          <w:bCs/>
+          <w:sz w:val="32"/>
+          <w:szCs w:val="28"/>
+          <w:lang w:val="en-AE"/>
+        </w:rPr>
+        <w:t>PANEL SETTINGS MODULE</w:t>
+      </w:r>
+    </w:p>
+    <w:p>
+      <w:pPr>
+        <w:spacing w:after="200" w:line="276" w:lineRule="auto"/>
+        <w:ind w:left="0" w:firstLine="0"/>
+        <w:rPr>
+          <w:lang w:val="en-AE"/>
+        </w:rPr>
+      </w:pPr>
+      <w:r>
+        <w:rPr>
+          <w:lang w:val="en-AE"/>
+        </w:rPr>
+        <w:t>This module is used to send configuration to a hardware device. It only shows nodes that have not yet been calibrated. The top part has a route selector, a panel location dropdown, and an IP address dropdown that stay linked together. Two read</w:t>
+      </w:r>
+      <w:r>
+        <w:rPr>
+          <w:lang w:val="en-AE"/>
+        </w:rPr>
+        <w:noBreakHyphen/>
+        <w:t>only fields show the panel description and the panel serial number. There is a checkbox labelled “OTA Deployment” that switches between two modes: USB serial and over</w:t>
+      </w:r>
+      <w:r>
+        <w:rPr>
+          <w:lang w:val="en-AE"/>
+        </w:rPr>
+        <w:noBreakHyphen/>
+        <w:t>the</w:t>
+      </w:r>
+      <w:r>
+        <w:rPr>
+          <w:lang w:val="en-AE"/>
+        </w:rPr>
+        <w:noBreakHyphen/>
+        <w:t>air via HTTP. In serial mode, the user sees a COM port selector, Connect/Disconnect buttons, and a large serial monitor area that shows live text from the device. The Deploy button is disabled while the serial port is open; the user must disconnect before deploying. In OTA mode, the serial controls are replaced with a text field for the device’s IP address, and Deploy sends an HTTP request instead. A </w:t>
+      </w:r>
+      <w:r>
+        <w:rPr>
+          <w:b/>
+          <w:bCs/>
+          <w:lang w:val="en-AE"/>
+        </w:rPr>
+        <w:t>Manual Calibrate</w:t>
+      </w:r>
+      <w:r>
+        <w:rPr>
+          <w:lang w:val="en-AE"/>
+        </w:rPr>
+        <w:t> button, visible only to the administrator, opens a hidden panel with three calibration fields: ACS Sensitivity 1, ACS Sensitivity 2, and Battery Calibration. If these fields are filled, the values are included in the JSON payload; if left empty, they are omitted. After a successful deploy, the node is marked as calibrated and disappears from the dropdown. A </w:t>
+      </w:r>
+      <w:r>
+        <w:rPr>
+          <w:b/>
+          <w:bCs/>
+          <w:lang w:val="en-AE"/>
+        </w:rPr>
+        <w:t>Reset Config</w:t>
+      </w:r>
+      <w:r>
+        <w:rPr>
+          <w:lang w:val="en-AE"/>
+        </w:rPr>
+        <w:t> button sends a special JSON command that wipes all stored settings on the device and restarts it to factory defaults.</w:t>
+      </w:r>
+    </w:p>
+    <w:p>
+      <w:pPr>
+        <w:spacing w:after="200" w:line="276" w:lineRule="auto"/>
+        <w:ind w:left="0" w:firstLine="0"/>
+        <w:rPr>
+          <w:lang w:val="en-AE"/>
+        </w:rPr>
+      </w:pPr>
+    </w:p>
+    <w:p>
+      <w:pPr>
+        <w:spacing w:after="200" w:line="276" w:lineRule="auto"/>
+        <w:ind w:left="0" w:firstLine="0"/>
+        <w:rPr>
+          <w:lang w:val="en-AE"/>
+        </w:rPr>
+      </w:pPr>
+      <w:r>
+        <w:rPr>
+          <w:lang w:val="en-AE"/>
+        </w:rPr>
+        <w:lastRenderedPageBreak/>
+        <w:drawing>
+          <wp:inline distT="0" distB="0" distL="0" distR="0" wp14:anchorId="4ED1A6F5" wp14:editId="737956E2">
+            <wp:extent cx="5731510" cy="2576830"/>
+            <wp:effectExtent l="0" t="0" r="2540" b="0"/>
+            <wp:docPr id="1367467316" name="Picture 1"/>
+            <wp:cNvGraphicFramePr>
+              <a:graphicFrameLocks xmlns:a="http://schemas.openxmlformats.org/drawingml/2006/main" noChangeAspect="1"/>
+            </wp:cNvGraphicFramePr>
+            <a:graphic xmlns:a="http://schemas.openxmlformats.org/drawingml/2006/main">
+              <a:graphicData uri="http://schemas.openxmlformats.org/drawingml/2006/picture">
+                <pic:pic xmlns:pic="http://schemas.openxmlformats.org/drawingml/2006/picture">
+                  <pic:nvPicPr>
+                    <pic:cNvPr id="1367467316" name=""/>
+                    <pic:cNvPicPr/>
+                  </pic:nvPicPr>
+                  <pic:blipFill>
+                    <a:blip r:embed="rId17"/>
+                    <a:stretch>
+                      <a:fillRect/>
+                    </a:stretch>
+                  </pic:blipFill>
+                  <pic:spPr>
+                    <a:xfrm>
+                      <a:off x="0" y="0"/>
+                      <a:ext cx="5731510" cy="2576830"/>
+                    </a:xfrm>
+                    <a:prstGeom prst="rect">
+                      <a:avLst/>
+                    </a:prstGeom>
+                  </pic:spPr>
+                </pic:pic>
+              </a:graphicData>
+            </a:graphic>
+          </wp:inline>
+        </w:drawing>
+      </w:r>
+    </w:p>
+    <w:p>
+      <w:pPr>
+        <w:spacing w:after="200" w:line="276" w:lineRule="auto"/>
+        <w:ind w:left="0" w:firstLine="0"/>
+        <w:jc w:val="center"/>
+        <w:rPr>
+          <w:b/>
+          <w:bCs/>
+        </w:rPr>
+      </w:pPr>
+      <w:r>
+        <w:rPr>
+          <w:b/>
+          <w:bCs/>
+        </w:rPr>
+        <w:t xml:space="preserve">Figure </w:t>
+      </w:r>
+      <w:r>
+        <w:rPr>
+          <w:b/>
+          <w:bCs/>
+        </w:rPr>
+        <w:t>4</w:t>
+      </w:r>
+      <w:r>
+        <w:rPr>
+          <w:b/>
+          <w:bCs/>
+        </w:rPr>
+        <w:t xml:space="preserve">.5: </w:t>
+      </w:r>
+      <w:r>
+        <w:rPr>
+          <w:b/>
+          <w:bCs/>
+        </w:rPr>
+        <w:t>Panel Settings User Control.</w:t>
+      </w:r>
+    </w:p>
+    <w:p>
+      <w:pPr>
+        <w:spacing w:after="200" w:line="276" w:lineRule="auto"/>
+        <w:ind w:left="0" w:firstLine="0"/>
+        <w:rPr>
+          <w:b/>
+          <w:bCs/>
+        </w:rPr>
+      </w:pPr>
+    </w:p>
+    <w:p>
+      <w:pPr>
+        <w:pStyle w:val="ListParagraph"/>
+        <w:numPr>
+          <w:ilvl w:val="1"/>
+          <w:numId w:val="27"/>
+        </w:numPr>
+        <w:spacing w:after="200" w:line="276" w:lineRule="auto"/>
+        <w:rPr>
+          <w:b/>
+          <w:bCs/>
+          <w:sz w:val="32"/>
+          <w:szCs w:val="28"/>
+          <w:lang w:val="en-AE"/>
+        </w:rPr>
+      </w:pPr>
+      <w:r>
+        <w:rPr>
+          <w:b/>
+          <w:bCs/>
+          <w:sz w:val="32"/>
+          <w:szCs w:val="28"/>
+          <w:lang w:val="en-AE"/>
+        </w:rPr>
+        <w:t>SETTINGS MODULE</w:t>
+      </w:r>
+    </w:p>
+    <w:p>
+      <w:pPr>
+        <w:spacing w:after="200" w:line="276" w:lineRule="auto"/>
+        <w:ind w:left="0" w:firstLine="0"/>
+        <w:rPr>
+          <w:lang w:val="en-AE"/>
+        </w:rPr>
+      </w:pPr>
+      <w:r>
+        <w:rPr>
+          <w:lang w:val="en-AE"/>
+        </w:rPr>
+        <w:t>The Settings module stores general application preferences. It shows four text boxes for the technician’s name, phone number, email, and address. Below these, a checkbox enables maintenance notifications. When the checkbox is ticked, a dropdown becomes available that lets the user pick a reminder frequency: one month, three months, six months, or twelve months. All values are saved to a JSON file on the computer, and they are loaded again each time the module is opened. This module does not use the database; it works entirely with the local file.</w:t>
+      </w:r>
+    </w:p>
+    <w:p>
+      <w:pPr>
+        <w:spacing w:after="200" w:line="276" w:lineRule="auto"/>
+        <w:ind w:left="0" w:firstLine="0"/>
+        <w:rPr>
+          <w:lang w:val="en-AE"/>
+        </w:rPr>
+      </w:pPr>
+      <w:r>
+        <w:rPr>
+          <w:lang w:val="en-AE"/>
+        </w:rPr>
+        <w:drawing>
+          <wp:inline distT="0" distB="0" distL="0" distR="0" wp14:anchorId="35BAC2D8" wp14:editId="4828837A">
+            <wp:extent cx="5394960" cy="3200755"/>
+            <wp:effectExtent l="0" t="0" r="0" b="0"/>
+            <wp:docPr id="1373243706" name="Picture 1"/>
+            <wp:cNvGraphicFramePr>
+              <a:graphicFrameLocks xmlns:a="http://schemas.openxmlformats.org/drawingml/2006/main" noChangeAspect="1"/>
+            </wp:cNvGraphicFramePr>
+            <a:graphic xmlns:a="http://schemas.openxmlformats.org/drawingml/2006/main">
+              <a:graphicData uri="http://schemas.openxmlformats.org/drawingml/2006/picture">
+                <pic:pic xmlns:pic="http://schemas.openxmlformats.org/drawingml/2006/picture">
+                  <pic:nvPicPr>
+                    <pic:cNvPr id="1373243706" name=""/>
+                    <pic:cNvPicPr/>
+                  </pic:nvPicPr>
+                  <pic:blipFill>
+                    <a:blip r:embed="rId18"/>
+                    <a:stretch>
+                      <a:fillRect/>
+                    </a:stretch>
+                  </pic:blipFill>
+                  <pic:spPr>
+                    <a:xfrm>
+                      <a:off x="0" y="0"/>
+                      <a:ext cx="5410502" cy="3209976"/>
+                    </a:xfrm>
+                    <a:prstGeom prst="rect">
+                      <a:avLst/>
+                    </a:prstGeom>
+                  </pic:spPr>
+                </pic:pic>
+              </a:graphicData>
+            </a:graphic>
+          </wp:inline>
+        </w:drawing>
+      </w:r>
+    </w:p>
+    <w:p>
+      <w:pPr>
+        <w:spacing w:after="200" w:line="276" w:lineRule="auto"/>
+        <w:ind w:left="0" w:firstLine="0"/>
+        <w:jc w:val="center"/>
+        <w:rPr>
+          <w:b/>
+          <w:bCs/>
+        </w:rPr>
+      </w:pPr>
+      <w:r>
+        <w:rPr>
+          <w:b/>
+          <w:bCs/>
+        </w:rPr>
+        <w:t xml:space="preserve">Figure </w:t>
+      </w:r>
+      <w:r>
+        <w:rPr>
+          <w:b/>
+          <w:bCs/>
+        </w:rPr>
+        <w:t>4</w:t>
+      </w:r>
+      <w:r>
+        <w:rPr>
+          <w:b/>
+          <w:bCs/>
+        </w:rPr>
+        <w:t>.</w:t>
+      </w:r>
+      <w:r>
+        <w:rPr>
+          <w:b/>
+          <w:bCs/>
+        </w:rPr>
+        <w:t>6</w:t>
+      </w:r>
+      <w:r>
+        <w:rPr>
+          <w:b/>
+          <w:bCs/>
+        </w:rPr>
+        <w:t xml:space="preserve">: </w:t>
+      </w:r>
+      <w:r>
+        <w:rPr>
+          <w:b/>
+          <w:bCs/>
+        </w:rPr>
+        <w:t>Settings</w:t>
+      </w:r>
+      <w:r>
+        <w:rPr>
+          <w:b/>
+          <w:bCs/>
+        </w:rPr>
+        <w:t xml:space="preserve"> </w:t>
+      </w:r>
+      <w:r>
+        <w:rPr>
+          <w:b/>
+          <w:bCs/>
+        </w:rPr>
+        <w:t>User Control.</w:t>
+      </w:r>
+    </w:p>
+    <w:p>
+      <w:pPr>
+        <w:pStyle w:val="ListParagraph"/>
+        <w:numPr>
+          <w:ilvl w:val="1"/>
+          <w:numId w:val="27"/>
+        </w:numPr>
+        <w:spacing w:after="200" w:line="276" w:lineRule="auto"/>
+        <w:rPr>
+          <w:b/>
+          <w:bCs/>
+          <w:sz w:val="32"/>
+          <w:szCs w:val="28"/>
+          <w:lang w:val="en-AE"/>
+        </w:rPr>
+      </w:pPr>
+      <w:r>
+        <w:rPr>
+          <w:b/>
+          <w:bCs/>
+          <w:sz w:val="32"/>
+          <w:szCs w:val="28"/>
+          <w:lang w:val="en-AE"/>
+        </w:rPr>
+        <w:lastRenderedPageBreak/>
+        <w:t>NETWORK CONFIGURATION MODULE</w:t>
+      </w:r>
+    </w:p>
+    <w:p>
+      <w:pPr>
+        <w:spacing w:after="200" w:line="276" w:lineRule="auto"/>
+        <w:ind w:left="0" w:firstLine="0"/>
+        <w:rPr>
+          <w:lang w:val="en-AE"/>
+        </w:rPr>
+      </w:pPr>
+      <w:r>
+        <w:rPr>
+          <w:lang w:val="en-AE"/>
+        </w:rPr>
+        <w:t>The Network module displays and allows editing of the host computer’s network settings. It shows Ethernet parameters (IP address, subnet mask, and default gateway) as three labelled text boxes. A checkbox labelled “Wi</w:t>
+      </w:r>
+      <w:r>
+        <w:rPr>
+          <w:lang w:val="en-AE"/>
+        </w:rPr>
+        <w:noBreakHyphen/>
+        <w:t>Fi Enabled” opens an extra panel with fields for the Wi</w:t>
+      </w:r>
+      <w:r>
+        <w:rPr>
+          <w:lang w:val="en-AE"/>
+        </w:rPr>
+        <w:noBreakHyphen/>
+        <w:t>Fi SSID, password (masked), IP address, subnet mask, and default gateway. All these values are saved to the same JSON file used by the Settings module. The information is for reference and documentation; it does not automatically change the computer’s real network configuration.</w:t>
+      </w:r>
+    </w:p>
+    <w:p>
+      <w:pPr>
+        <w:spacing w:after="200" w:line="276" w:lineRule="auto"/>
+        <w:ind w:left="0" w:firstLine="0"/>
+        <w:rPr>
+          <w:lang w:val="en-AE"/>
+        </w:rPr>
+      </w:pPr>
+      <w:r>
+        <w:rPr>
+          <w:lang w:val="en-AE"/>
+        </w:rPr>
+        <w:drawing>
+          <wp:inline distT="0" distB="0" distL="0" distR="0" wp14:anchorId="4723022C" wp14:editId="72B05E7E">
+            <wp:extent cx="5731510" cy="3403600"/>
+            <wp:effectExtent l="0" t="0" r="2540" b="6350"/>
+            <wp:docPr id="685741253" name="Picture 1"/>
+            <wp:cNvGraphicFramePr>
+              <a:graphicFrameLocks xmlns:a="http://schemas.openxmlformats.org/drawingml/2006/main" noChangeAspect="1"/>
+            </wp:cNvGraphicFramePr>
+            <a:graphic xmlns:a="http://schemas.openxmlformats.org/drawingml/2006/main">
+              <a:graphicData uri="http://schemas.openxmlformats.org/drawingml/2006/picture">
+                <pic:pic xmlns:pic="http://schemas.openxmlformats.org/drawingml/2006/picture">
+                  <pic:nvPicPr>
+                    <pic:cNvPr id="685741253" name=""/>
+                    <pic:cNvPicPr/>
+                  </pic:nvPicPr>
+                  <pic:blipFill>
+                    <a:blip r:embed="rId19"/>
+                    <a:stretch>
+                      <a:fillRect/>
+                    </a:stretch>
+                  </pic:blipFill>
+                  <pic:spPr>
+                    <a:xfrm>
+                      <a:off x="0" y="0"/>
+                      <a:ext cx="5731510" cy="3403600"/>
+                    </a:xfrm>
+                    <a:prstGeom prst="rect">
+                      <a:avLst/>
+                    </a:prstGeom>
+                  </pic:spPr>
+                </pic:pic>
+              </a:graphicData>
+            </a:graphic>
+          </wp:inline>
+        </w:drawing>
+      </w:r>
+    </w:p>
+    <w:p>
+      <w:pPr>
+        <w:spacing w:after="200" w:line="276" w:lineRule="auto"/>
+        <w:ind w:left="0" w:firstLine="0"/>
+        <w:jc w:val="center"/>
+        <w:rPr>
+          <w:b/>
+          <w:bCs/>
+        </w:rPr>
+      </w:pPr>
+      <w:r>
+        <w:rPr>
+          <w:b/>
+          <w:bCs/>
+        </w:rPr>
+        <w:t xml:space="preserve">Figure </w:t>
+      </w:r>
+      <w:r>
+        <w:rPr>
+          <w:b/>
+          <w:bCs/>
+        </w:rPr>
+        <w:t>4</w:t>
+      </w:r>
+      <w:r>
+        <w:rPr>
+          <w:b/>
+          <w:bCs/>
+        </w:rPr>
+        <w:t>.</w:t>
+      </w:r>
+      <w:r>
+        <w:rPr>
+          <w:b/>
+          <w:bCs/>
+        </w:rPr>
+        <w:t>7</w:t>
+      </w:r>
+      <w:r>
+        <w:rPr>
+          <w:b/>
+          <w:bCs/>
+        </w:rPr>
+        <w:t xml:space="preserve">: </w:t>
+      </w:r>
+      <w:r>
+        <w:rPr>
+          <w:b/>
+          <w:bCs/>
+        </w:rPr>
+        <w:t>Network Settings User Control.</w:t>
+      </w:r>
+    </w:p>
+    <w:p>
+      <w:pPr>
+        <w:spacing w:after="200" w:line="276" w:lineRule="auto"/>
+        <w:ind w:left="0" w:firstLine="0"/>
+        <w:rPr>
+          <w:lang w:val="en-AE"/>
+        </w:rPr>
+      </w:pPr>
+    </w:p>
+    <w:p>
+      <w:pPr>
+        <w:pStyle w:val="ListParagraph"/>
+        <w:numPr>
+          <w:ilvl w:val="1"/>
+          <w:numId w:val="27"/>
+        </w:numPr>
+        <w:spacing w:after="200" w:line="276" w:lineRule="auto"/>
+        <w:rPr>
+          <w:b/>
+          <w:bCs/>
+          <w:sz w:val="32"/>
+          <w:szCs w:val="28"/>
+          <w:lang w:val="en-AE"/>
+        </w:rPr>
+      </w:pPr>
+      <w:r>
+        <w:rPr>
+          <w:b/>
+          <w:bCs/>
+          <w:sz w:val="32"/>
+          <w:szCs w:val="28"/>
+          <w:lang w:val="en-AE"/>
+        </w:rPr>
+        <w:t>I/O ACTIVITY MODULE</w:t>
+      </w:r>
+    </w:p>
+    <w:p>
+      <w:pPr>
+        <w:spacing w:after="200" w:line="276" w:lineRule="auto"/>
+        <w:ind w:left="0" w:firstLine="0"/>
+        <w:rPr>
+          <w:lang w:val="en-AE"/>
+        </w:rPr>
+      </w:pPr>
+      <w:r>
+        <w:rPr>
+          <w:lang w:val="en-AE"/>
+        </w:rPr>
+        <w:t>This module is a placeholder for future development. Its intended purpose is to display live input/output data, such as sensor readings and relay states, from connected devices. In the current version of the application, it loads a blank page with its name displayed, ready for later implementation when the monitoring feature is added.</w:t>
+      </w:r>
+    </w:p>
+    <w:p>
+      <w:pPr>
+        <w:spacing w:after="200" w:line="276" w:lineRule="auto"/>
+        <w:ind w:left="0" w:firstLine="0"/>
+        <w:rPr>
+          <w:lang w:val="en-AE"/>
+        </w:rPr>
+      </w:pPr>
+    </w:p>
+    <w:p>
+      <w:pPr>
+        <w:pStyle w:val="ListParagraph"/>
+        <w:numPr>
+          <w:ilvl w:val="1"/>
+          <w:numId w:val="27"/>
+        </w:numPr>
+        <w:spacing w:after="200" w:line="276" w:lineRule="auto"/>
+        <w:rPr>
+          <w:b/>
+          <w:bCs/>
+          <w:sz w:val="32"/>
+          <w:szCs w:val="28"/>
+          <w:lang w:val="en-AE"/>
+        </w:rPr>
+      </w:pPr>
+      <w:r>
+        <w:rPr>
+          <w:b/>
+          <w:bCs/>
+          <w:sz w:val="32"/>
+          <w:szCs w:val="28"/>
+          <w:lang w:val="en-AE"/>
+        </w:rPr>
+        <w:t>UPLOAD/DOWNLOAD MODULE</w:t>
+      </w:r>
+    </w:p>
+    <w:p>
+      <w:pPr>
+        <w:spacing w:after="200" w:line="276" w:lineRule="auto"/>
+        <w:ind w:left="0" w:firstLine="0"/>
+        <w:rPr>
+          <w:lang w:val="en-AE"/>
+        </w:rPr>
+      </w:pPr>
+      <w:r>
+        <w:rPr>
+          <w:lang w:val="en-AE"/>
+        </w:rPr>
+        <w:t xml:space="preserve">The Upload/Download module is also a placeholder. It will eventually allow users to import node and area data from an Excel spreadsheet, which is useful when setting up a large number of devices at once. It will also provide an export function to download the current database </w:t>
+      </w:r>
+      <w:r>
+        <w:rPr>
+          <w:lang w:val="en-AE"/>
+        </w:rPr>
+        <w:lastRenderedPageBreak/>
+        <w:t>contents into an Excel template for offline editing. For now, the module shows only a label indicating that the feature is under development.</w:t>
+      </w:r>
+    </w:p>
+    <w:p>
+      <w:pPr>
+        <w:spacing w:after="200" w:line="276" w:lineRule="auto"/>
+        <w:ind w:left="0" w:firstLine="0"/>
+        <w:rPr>
+          <w:lang w:val="en-AE"/>
+        </w:rPr>
+      </w:pPr>
+    </w:p>
+    <w:p>
+      <w:pPr>
+        <w:pStyle w:val="ListParagraph"/>
+        <w:numPr>
+          <w:ilvl w:val="1"/>
+          <w:numId w:val="27"/>
+        </w:numPr>
+        <w:spacing w:after="200" w:line="276" w:lineRule="auto"/>
+        <w:rPr>
+          <w:b/>
+          <w:bCs/>
+          <w:sz w:val="32"/>
+          <w:szCs w:val="28"/>
+          <w:lang w:val="en-AE"/>
+        </w:rPr>
+      </w:pPr>
+      <w:r>
+        <w:rPr>
+          <w:b/>
+          <w:bCs/>
+          <w:sz w:val="32"/>
+          <w:szCs w:val="28"/>
+          <w:lang w:val="en-AE"/>
+        </w:rPr>
+        <w:t>TESTS MODULE</w:t>
+      </w:r>
+    </w:p>
+    <w:p>
+      <w:pPr>
+        <w:spacing w:after="200" w:line="276" w:lineRule="auto"/>
+        <w:ind w:left="0" w:firstLine="0"/>
+        <w:rPr>
+          <w:lang w:val="en-AE"/>
+        </w:rPr>
+      </w:pPr>
+      <w:r>
+        <w:rPr>
+          <w:lang w:val="en-AE"/>
+        </w:rPr>
+        <w:t>The Tests module is planned for performing diagnostic checks on devices using the Modbus TCP protocol. It will let an operator select one or more nodes and run test sequences, such as toggling relays or reading sensor values, and see the results in real time. Like the I/O Activity and Upload/Download modules, it currently appears as a placeholder with its name, waiting for future coding.</w:t>
+      </w:r>
+    </w:p>
+    <w:p>
+      <w:pPr>
+        <w:spacing w:after="200" w:line="276" w:lineRule="auto"/>
+        <w:ind w:left="0" w:firstLine="0"/>
+        <w:rPr>
+          <w:lang w:val="en-AE"/>
+        </w:rPr>
       </w:pPr>
     </w:p>
     <w:sectPr>
-      <w:headerReference w:type="default" r:id="rId13"/>
-      <w:footerReference w:type="default" r:id="rId14"/>
+      <w:headerReference w:type="default" r:id="rId20"/>
+      <w:footerReference w:type="default" r:id="rId21"/>
       <w:pgSz w:w="11906" w:h="16838"/>
       <w:pgMar w:top="1440" w:right="1440" w:bottom="1440" w:left="1440" w:header="708" w:footer="708" w:gutter="0"/>
       <w:cols w:space="708"/>
@@ -2696,6 +4259,205 @@
 <file path=word/numbering.xml><?xml version="1.0" encoding="utf-8"?>
 <w:numbering xmlns:wpc="http://schemas.microsoft.com/office/word/2010/wordprocessingCanvas" xmlns:cx="http://schemas.microsoft.com/office/drawing/2014/chartex" xmlns:cx1="http://schemas.microsoft.com/office/drawing/2015/9/8/chartex" xmlns:cx2="http://schemas.microsoft.com/office/drawing/2015/10/21/chartex" xmlns:cx3="http://schemas.microsoft.com/office/drawing/2016/5/9/chartex" xmlns:cx4="http://schemas.microsoft.com/office/drawing/2016/5/10/chartex" xmlns:cx5="http://schemas.microsoft.com/office/drawing/2016/5/11/chartex" xmlns:cx6="http://schemas.microsoft.com/office/drawing/2016/5/12/chartex" xmlns:cx7="http://schemas.microsoft.com/office/drawing/2016/5/13/chartex" xmlns:cx8="http://schemas.microsoft.com/office/drawing/2016/5/14/chartex" xmlns:mc="http://schemas.openxmlformats.org/markup-compatibility/2006" xmlns:aink="http://schemas.microsoft.com/office/drawing/2016/ink" xmlns:am3d="http://schemas.microsoft.com/office/drawing/2017/model3d" xmlns:o="urn:schemas-microsoft-com:office:office" xmlns:oel="http://schemas.microsoft.com/office/2019/extlst" xmlns:r="http://schemas.openxmlformats.org/officeDocument/2006/relationships" xmlns:m="http://schemas.openxmlformats.org/officeDocument/2006/math" xmlns:v="urn:schemas-microsoft-com:vml" xmlns:wp14="http://schemas.microsoft.com/office/word/2010/wordprocessingDrawing" xmlns:wp="http://schemas.openxmlformats.org/drawingml/2006/wordprocessingDrawing" xmlns:w10="urn:schemas-microsoft-com:office:word" xmlns:w="http://schemas.openxmlformats.org/wordprocessingml/2006/main" xmlns:w14="http://schemas.microsoft.com/office/word/2010/wordml" xmlns:w15="http://schemas.microsoft.com/office/word/2012/wordml" xmlns:w16cex="http://schemas.microsoft.com/office/word/2018/wordml/cex" xmlns:w16cid="http://schemas.microsoft.com/office/word/2016/wordml/cid" xmlns:w16="http://schemas.microsoft.com/office/word/2018/wordml" xmlns:w16du="http://schemas.microsoft.com/office/word/2023/wordml/word16du" xmlns:w16sdtdh="http://schemas.microsoft.com/office/word/2020/wordml/sdtdatahash" xmlns:w16sdtfl="http://schemas.microsoft.com/office/word/2024/wordml/sdtformatlock" xmlns:w16se="http://schemas.microsoft.com/office/word/2015/wordml/symex" xmlns:wpg="http://schemas.microsoft.com/office/word/2010/wordprocessingGroup" xmlns:wpi="http://schemas.microsoft.com/office/word/2010/wordprocessingInk" xmlns:wne="http://schemas.microsoft.com/office/word/2006/wordml" xmlns:wps="http://schemas.microsoft.com/office/word/2010/wordprocessingShape" mc:Ignorable="w14 w15 w16se w16cid w16 w16cex w16sdtdh w16sdtfl w16du wp14">
   <w:abstractNum w:abstractNumId="0" w15:restartNumberingAfterBreak="0">
+    <w:nsid w:val="03D4131E"/>
+    <w:multiLevelType w:val="multilevel"/>
+    <w:tmpl w:val="2E0E4818"/>
+    <w:lvl w:ilvl="0">
+      <w:start w:val="4"/>
+      <w:numFmt w:val="decimal"/>
+      <w:lvlText w:val="%1"/>
+      <w:lvlJc w:val="left"/>
+      <w:pPr>
+        <w:ind w:left="420" w:hanging="420"/>
+      </w:pPr>
+      <w:rPr>
+        <w:rFonts w:hint="default"/>
+      </w:rPr>
+    </w:lvl>
+    <w:lvl w:ilvl="1">
+      <w:start w:val="1"/>
+      <w:numFmt w:val="decimal"/>
+      <w:lvlText w:val="%1.%2"/>
+      <w:lvlJc w:val="left"/>
+      <w:pPr>
+        <w:ind w:left="720" w:hanging="720"/>
+      </w:pPr>
+      <w:rPr>
+        <w:rFonts w:hint="default"/>
+      </w:rPr>
+    </w:lvl>
+    <w:lvl w:ilvl="2">
+      <w:start w:val="1"/>
+      <w:numFmt w:val="decimal"/>
+      <w:lvlText w:val="%1.%2.%3"/>
+      <w:lvlJc w:val="left"/>
+      <w:pPr>
+        <w:ind w:left="720" w:hanging="720"/>
+      </w:pPr>
+      <w:rPr>
+        <w:rFonts w:hint="default"/>
+      </w:rPr>
+    </w:lvl>
+    <w:lvl w:ilvl="3">
+      <w:start w:val="1"/>
+      <w:numFmt w:val="decimal"/>
+      <w:lvlText w:val="%1.%2.%3.%4"/>
+      <w:lvlJc w:val="left"/>
+      <w:pPr>
+        <w:ind w:left="1080" w:hanging="1080"/>
+      </w:pPr>
+      <w:rPr>
+        <w:rFonts w:hint="default"/>
+      </w:rPr>
+    </w:lvl>
+    <w:lvl w:ilvl="4">
+      <w:start w:val="1"/>
+      <w:numFmt w:val="decimal"/>
+      <w:lvlText w:val="%1.%2.%3.%4.%5"/>
+      <w:lvlJc w:val="left"/>
+      <w:pPr>
+        <w:ind w:left="1440" w:hanging="1440"/>
+      </w:pPr>
+      <w:rPr>
+        <w:rFonts w:hint="default"/>
+      </w:rPr>
+    </w:lvl>
+    <w:lvl w:ilvl="5">
+      <w:start w:val="1"/>
+      <w:numFmt w:val="decimal"/>
+      <w:lvlText w:val="%1.%2.%3.%4.%5.%6"/>
+      <w:lvlJc w:val="left"/>
+      <w:pPr>
+        <w:ind w:left="1440" w:hanging="1440"/>
+      </w:pPr>
+      <w:rPr>
+        <w:rFonts w:hint="default"/>
+      </w:rPr>
+    </w:lvl>
+    <w:lvl w:ilvl="6">
+      <w:start w:val="1"/>
+      <w:numFmt w:val="decimal"/>
+      <w:lvlText w:val="%1.%2.%3.%4.%5.%6.%7"/>
+      <w:lvlJc w:val="left"/>
+      <w:pPr>
+        <w:ind w:left="1800" w:hanging="1800"/>
+      </w:pPr>
+      <w:rPr>
+        <w:rFonts w:hint="default"/>
+      </w:rPr>
+    </w:lvl>
+    <w:lvl w:ilvl="7">
+      <w:start w:val="1"/>
+      <w:numFmt w:val="decimal"/>
+      <w:lvlText w:val="%1.%2.%3.%4.%5.%6.%7.%8"/>
+      <w:lvlJc w:val="left"/>
+      <w:pPr>
+        <w:ind w:left="2160" w:hanging="2160"/>
+      </w:pPr>
+      <w:rPr>
+        <w:rFonts w:hint="default"/>
+      </w:rPr>
+    </w:lvl>
+    <w:lvl w:ilvl="8">
+      <w:start w:val="1"/>
+      <w:numFmt w:val="decimal"/>
+      <w:lvlText w:val="%1.%2.%3.%4.%5.%6.%7.%8.%9"/>
+      <w:lvlJc w:val="left"/>
+      <w:pPr>
+        <w:ind w:left="2160" w:hanging="2160"/>
+      </w:pPr>
+      <w:rPr>
+        <w:rFonts w:hint="default"/>
+      </w:rPr>
+    </w:lvl>
+  </w:abstractNum>
+  <w:abstractNum w:abstractNumId="1" w15:restartNumberingAfterBreak="0">
+    <w:nsid w:val="068D0083"/>
+    <w:multiLevelType w:val="hybridMultilevel"/>
+    <w:tmpl w:val="AE00B5C8"/>
+    <w:lvl w:ilvl="0" w:tplc="4C09000F">
+      <w:start w:val="1"/>
+      <w:numFmt w:val="decimal"/>
+      <w:lvlText w:val="%1."/>
+      <w:lvlJc w:val="left"/>
+      <w:pPr>
+        <w:ind w:left="720" w:hanging="360"/>
+      </w:pPr>
+    </w:lvl>
+    <w:lvl w:ilvl="1" w:tplc="4C090019" w:tentative="1">
+      <w:start w:val="1"/>
+      <w:numFmt w:val="lowerLetter"/>
+      <w:lvlText w:val="%2."/>
+      <w:lvlJc w:val="left"/>
+      <w:pPr>
+        <w:ind w:left="1440" w:hanging="360"/>
+      </w:pPr>
+    </w:lvl>
+    <w:lvl w:ilvl="2" w:tplc="4C09001B" w:tentative="1">
+      <w:start w:val="1"/>
+      <w:numFmt w:val="lowerRoman"/>
+      <w:lvlText w:val="%3."/>
+      <w:lvlJc w:val="right"/>
+      <w:pPr>
+        <w:ind w:left="2160" w:hanging="180"/>
+      </w:pPr>
+    </w:lvl>
+    <w:lvl w:ilvl="3" w:tplc="4C09000F" w:tentative="1">
+      <w:start w:val="1"/>
+      <w:numFmt w:val="decimal"/>
+      <w:lvlText w:val="%4."/>
+      <w:lvlJc w:val="left"/>
+      <w:pPr>
+        <w:ind w:left="2880" w:hanging="360"/>
+      </w:pPr>
+    </w:lvl>
+    <w:lvl w:ilvl="4" w:tplc="4C090019" w:tentative="1">
+      <w:start w:val="1"/>
+      <w:numFmt w:val="lowerLetter"/>
+      <w:lvlText w:val="%5."/>
+      <w:lvlJc w:val="left"/>
+      <w:pPr>
+        <w:ind w:left="3600" w:hanging="360"/>
+      </w:pPr>
+    </w:lvl>
+    <w:lvl w:ilvl="5" w:tplc="4C09001B" w:tentative="1">
+      <w:start w:val="1"/>
+      <w:numFmt w:val="lowerRoman"/>
+      <w:lvlText w:val="%6."/>
+      <w:lvlJc w:val="right"/>
+      <w:pPr>
+        <w:ind w:left="4320" w:hanging="180"/>
+      </w:pPr>
+    </w:lvl>
+    <w:lvl w:ilvl="6" w:tplc="4C09000F" w:tentative="1">
+      <w:start w:val="1"/>
+      <w:numFmt w:val="decimal"/>
+      <w:lvlText w:val="%7."/>
+      <w:lvlJc w:val="left"/>
+      <w:pPr>
+        <w:ind w:left="5040" w:hanging="360"/>
+      </w:pPr>
+    </w:lvl>
+    <w:lvl w:ilvl="7" w:tplc="4C090019" w:tentative="1">
+      <w:start w:val="1"/>
+      <w:numFmt w:val="lowerLetter"/>
+      <w:lvlText w:val="%8."/>
+      <w:lvlJc w:val="left"/>
+      <w:pPr>
+        <w:ind w:left="5760" w:hanging="360"/>
+      </w:pPr>
+    </w:lvl>
+    <w:lvl w:ilvl="8" w:tplc="4C09001B" w:tentative="1">
+      <w:start w:val="1"/>
+      <w:numFmt w:val="lowerRoman"/>
+      <w:lvlText w:val="%9."/>
+      <w:lvlJc w:val="right"/>
+      <w:pPr>
+        <w:ind w:left="6480" w:hanging="180"/>
+      </w:pPr>
+    </w:lvl>
+  </w:abstractNum>
+  <w:abstractNum w:abstractNumId="2" w15:restartNumberingAfterBreak="0">
     <w:nsid w:val="0D19307B"/>
     <w:multiLevelType w:val="hybridMultilevel"/>
     <w:tmpl w:val="3F60A284"/>
@@ -2808,7 +4570,7 @@
       </w:rPr>
     </w:lvl>
   </w:abstractNum>
-  <w:abstractNum w:abstractNumId="1" w15:restartNumberingAfterBreak="0">
+  <w:abstractNum w:abstractNumId="3" w15:restartNumberingAfterBreak="0">
     <w:nsid w:val="0FF02473"/>
     <w:multiLevelType w:val="hybridMultilevel"/>
     <w:tmpl w:val="24622ABE"/>
@@ -2921,7 +4683,7 @@
       </w:rPr>
     </w:lvl>
   </w:abstractNum>
-  <w:abstractNum w:abstractNumId="2" w15:restartNumberingAfterBreak="0">
+  <w:abstractNum w:abstractNumId="4" w15:restartNumberingAfterBreak="0">
     <w:nsid w:val="100247D7"/>
     <w:multiLevelType w:val="multilevel"/>
     <w:tmpl w:val="B1A47AD8"/>
@@ -3034,7 +4796,7 @@
       </w:rPr>
     </w:lvl>
   </w:abstractNum>
-  <w:abstractNum w:abstractNumId="3" w15:restartNumberingAfterBreak="0">
+  <w:abstractNum w:abstractNumId="5" w15:restartNumberingAfterBreak="0">
     <w:nsid w:val="10B63A5E"/>
     <w:multiLevelType w:val="multilevel"/>
     <w:tmpl w:val="D2BC369C"/>
@@ -3147,7 +4909,7 @@
       </w:rPr>
     </w:lvl>
   </w:abstractNum>
-  <w:abstractNum w:abstractNumId="4" w15:restartNumberingAfterBreak="0">
+  <w:abstractNum w:abstractNumId="6" w15:restartNumberingAfterBreak="0">
     <w:nsid w:val="15DC5130"/>
     <w:multiLevelType w:val="hybridMultilevel"/>
     <w:tmpl w:val="F94C687A"/>
@@ -3260,7 +5022,7 @@
       </w:rPr>
     </w:lvl>
   </w:abstractNum>
-  <w:abstractNum w:abstractNumId="5" w15:restartNumberingAfterBreak="0">
+  <w:abstractNum w:abstractNumId="7" w15:restartNumberingAfterBreak="0">
     <w:nsid w:val="18262D6C"/>
     <w:multiLevelType w:val="multilevel"/>
     <w:tmpl w:val="7CA41D6A"/>
@@ -3373,7 +5135,7 @@
       </w:rPr>
     </w:lvl>
   </w:abstractNum>
-  <w:abstractNum w:abstractNumId="6" w15:restartNumberingAfterBreak="0">
+  <w:abstractNum w:abstractNumId="8" w15:restartNumberingAfterBreak="0">
     <w:nsid w:val="1ABC5460"/>
     <w:multiLevelType w:val="hybridMultilevel"/>
     <w:tmpl w:val="3E524044"/>
@@ -3486,7 +5248,7 @@
       </w:rPr>
     </w:lvl>
   </w:abstractNum>
-  <w:abstractNum w:abstractNumId="7" w15:restartNumberingAfterBreak="0">
+  <w:abstractNum w:abstractNumId="9" w15:restartNumberingAfterBreak="0">
     <w:nsid w:val="214A4329"/>
     <w:multiLevelType w:val="multilevel"/>
     <w:tmpl w:val="90FCADC0"/>
@@ -3635,7 +5397,7 @@
       </w:rPr>
     </w:lvl>
   </w:abstractNum>
-  <w:abstractNum w:abstractNumId="8" w15:restartNumberingAfterBreak="0">
+  <w:abstractNum w:abstractNumId="10" w15:restartNumberingAfterBreak="0">
     <w:nsid w:val="23622A08"/>
     <w:multiLevelType w:val="hybridMultilevel"/>
     <w:tmpl w:val="55D2F216"/>
@@ -3748,7 +5510,7 @@
       </w:rPr>
     </w:lvl>
   </w:abstractNum>
-  <w:abstractNum w:abstractNumId="9" w15:restartNumberingAfterBreak="0">
+  <w:abstractNum w:abstractNumId="11" w15:restartNumberingAfterBreak="0">
     <w:nsid w:val="24FB7D39"/>
     <w:multiLevelType w:val="hybridMultilevel"/>
     <w:tmpl w:val="7C74CC1E"/>
@@ -3861,7 +5623,7 @@
       </w:rPr>
     </w:lvl>
   </w:abstractNum>
-  <w:abstractNum w:abstractNumId="10" w15:restartNumberingAfterBreak="0">
+  <w:abstractNum w:abstractNumId="12" w15:restartNumberingAfterBreak="0">
     <w:nsid w:val="28F920D6"/>
     <w:multiLevelType w:val="hybridMultilevel"/>
     <w:tmpl w:val="DFBCDEFE"/>
@@ -3947,7 +5709,7 @@
       </w:pPr>
     </w:lvl>
   </w:abstractNum>
-  <w:abstractNum w:abstractNumId="11" w15:restartNumberingAfterBreak="0">
+  <w:abstractNum w:abstractNumId="13" w15:restartNumberingAfterBreak="0">
     <w:nsid w:val="2B300962"/>
     <w:multiLevelType w:val="multilevel"/>
     <w:tmpl w:val="29920C9E"/>
@@ -4060,7 +5822,7 @@
       </w:rPr>
     </w:lvl>
   </w:abstractNum>
-  <w:abstractNum w:abstractNumId="12" w15:restartNumberingAfterBreak="0">
+  <w:abstractNum w:abstractNumId="14" w15:restartNumberingAfterBreak="0">
     <w:nsid w:val="2DEA23FD"/>
     <w:multiLevelType w:val="multilevel"/>
     <w:tmpl w:val="9DB6D834"/>
@@ -4173,7 +5935,7 @@
       </w:rPr>
     </w:lvl>
   </w:abstractNum>
-  <w:abstractNum w:abstractNumId="13" w15:restartNumberingAfterBreak="0">
+  <w:abstractNum w:abstractNumId="15" w15:restartNumberingAfterBreak="0">
     <w:nsid w:val="33FA4D93"/>
     <w:multiLevelType w:val="hybridMultilevel"/>
     <w:tmpl w:val="E8602B9A"/>
@@ -4263,7 +6025,7 @@
       </w:pPr>
     </w:lvl>
   </w:abstractNum>
-  <w:abstractNum w:abstractNumId="14" w15:restartNumberingAfterBreak="0">
+  <w:abstractNum w:abstractNumId="16" w15:restartNumberingAfterBreak="0">
     <w:nsid w:val="34525F03"/>
     <w:multiLevelType w:val="multilevel"/>
     <w:tmpl w:val="6AD02564"/>
@@ -4376,7 +6138,7 @@
       </w:rPr>
     </w:lvl>
   </w:abstractNum>
-  <w:abstractNum w:abstractNumId="15" w15:restartNumberingAfterBreak="0">
+  <w:abstractNum w:abstractNumId="17" w15:restartNumberingAfterBreak="0">
     <w:nsid w:val="37A915C6"/>
     <w:multiLevelType w:val="multilevel"/>
     <w:tmpl w:val="1C7C476E"/>
@@ -4489,7 +6251,7 @@
       </w:rPr>
     </w:lvl>
   </w:abstractNum>
-  <w:abstractNum w:abstractNumId="16" w15:restartNumberingAfterBreak="0">
+  <w:abstractNum w:abstractNumId="18" w15:restartNumberingAfterBreak="0">
     <w:nsid w:val="3DFB104C"/>
     <w:multiLevelType w:val="hybridMultilevel"/>
     <w:tmpl w:val="C7FE06D6"/>
@@ -4602,7 +6364,7 @@
       </w:rPr>
     </w:lvl>
   </w:abstractNum>
-  <w:abstractNum w:abstractNumId="17" w15:restartNumberingAfterBreak="0">
+  <w:abstractNum w:abstractNumId="19" w15:restartNumberingAfterBreak="0">
     <w:nsid w:val="465C6A32"/>
     <w:multiLevelType w:val="hybridMultilevel"/>
     <w:tmpl w:val="84088518"/>
@@ -4715,7 +6477,7 @@
       </w:rPr>
     </w:lvl>
   </w:abstractNum>
-  <w:abstractNum w:abstractNumId="18" w15:restartNumberingAfterBreak="0">
+  <w:abstractNum w:abstractNumId="20" w15:restartNumberingAfterBreak="0">
     <w:nsid w:val="56FA00E6"/>
     <w:multiLevelType w:val="hybridMultilevel"/>
     <w:tmpl w:val="67BC2F24"/>
@@ -4828,7 +6590,7 @@
       </w:rPr>
     </w:lvl>
   </w:abstractNum>
-  <w:abstractNum w:abstractNumId="19" w15:restartNumberingAfterBreak="0">
+  <w:abstractNum w:abstractNumId="21" w15:restartNumberingAfterBreak="0">
     <w:nsid w:val="5DB10780"/>
     <w:multiLevelType w:val="hybridMultilevel"/>
     <w:tmpl w:val="BCEC1C6E"/>
@@ -4941,7 +6703,7 @@
       </w:rPr>
     </w:lvl>
   </w:abstractNum>
-  <w:abstractNum w:abstractNumId="20" w15:restartNumberingAfterBreak="0">
+  <w:abstractNum w:abstractNumId="22" w15:restartNumberingAfterBreak="0">
     <w:nsid w:val="60323A98"/>
     <w:multiLevelType w:val="multilevel"/>
     <w:tmpl w:val="479C90FE"/>
@@ -5054,7 +6816,7 @@
       </w:rPr>
     </w:lvl>
   </w:abstractNum>
-  <w:abstractNum w:abstractNumId="21" w15:restartNumberingAfterBreak="0">
+  <w:abstractNum w:abstractNumId="23" w15:restartNumberingAfterBreak="0">
     <w:nsid w:val="61B2257E"/>
     <w:multiLevelType w:val="multilevel"/>
     <w:tmpl w:val="10A01AA6"/>
@@ -5167,7 +6929,7 @@
       </w:pPr>
     </w:lvl>
   </w:abstractNum>
-  <w:abstractNum w:abstractNumId="22" w15:restartNumberingAfterBreak="0">
+  <w:abstractNum w:abstractNumId="24" w15:restartNumberingAfterBreak="0">
     <w:nsid w:val="6BBA075C"/>
     <w:multiLevelType w:val="hybridMultilevel"/>
     <w:tmpl w:val="F33E1C36"/>
@@ -5280,7 +7042,7 @@
       </w:rPr>
     </w:lvl>
   </w:abstractNum>
-  <w:abstractNum w:abstractNumId="23" w15:restartNumberingAfterBreak="0">
+  <w:abstractNum w:abstractNumId="25" w15:restartNumberingAfterBreak="0">
     <w:nsid w:val="76212828"/>
     <w:multiLevelType w:val="multilevel"/>
     <w:tmpl w:val="7CA41D6A"/>
@@ -5393,7 +7155,7 @@
       </w:rPr>
     </w:lvl>
   </w:abstractNum>
-  <w:abstractNum w:abstractNumId="24" w15:restartNumberingAfterBreak="0">
+  <w:abstractNum w:abstractNumId="26" w15:restartNumberingAfterBreak="0">
     <w:nsid w:val="76346BBD"/>
     <w:multiLevelType w:val="multilevel"/>
     <w:tmpl w:val="1F72D42A"/>
@@ -5507,79 +7269,85 @@
     </w:lvl>
   </w:abstractNum>
   <w:num w:numId="1" w16cid:durableId="83502549">
+    <w:abstractNumId w:val="17"/>
+  </w:num>
+  <w:num w:numId="2" w16cid:durableId="140196070">
+    <w:abstractNumId w:val="23"/>
+  </w:num>
+  <w:num w:numId="3" w16cid:durableId="963803966">
     <w:abstractNumId w:val="15"/>
   </w:num>
-  <w:num w:numId="2" w16cid:durableId="140196070">
+  <w:num w:numId="4" w16cid:durableId="1610504365">
+    <w:abstractNumId w:val="22"/>
+  </w:num>
+  <w:num w:numId="5" w16cid:durableId="630333050">
+    <w:abstractNumId w:val="6"/>
+  </w:num>
+  <w:num w:numId="6" w16cid:durableId="924647596">
+    <w:abstractNumId w:val="18"/>
+  </w:num>
+  <w:num w:numId="7" w16cid:durableId="502210155">
+    <w:abstractNumId w:val="4"/>
+  </w:num>
+  <w:num w:numId="8" w16cid:durableId="798911664">
+    <w:abstractNumId w:val="5"/>
+  </w:num>
+  <w:num w:numId="9" w16cid:durableId="337194705">
+    <w:abstractNumId w:val="9"/>
+  </w:num>
+  <w:num w:numId="10" w16cid:durableId="401147243">
+    <w:abstractNumId w:val="8"/>
+  </w:num>
+  <w:num w:numId="11" w16cid:durableId="1199078558">
+    <w:abstractNumId w:val="3"/>
+  </w:num>
+  <w:num w:numId="12" w16cid:durableId="520751226">
     <w:abstractNumId w:val="21"/>
   </w:num>
-  <w:num w:numId="3" w16cid:durableId="963803966">
+  <w:num w:numId="13" w16cid:durableId="1870873736">
+    <w:abstractNumId w:val="20"/>
+  </w:num>
+  <w:num w:numId="14" w16cid:durableId="2113938710">
+    <w:abstractNumId w:val="24"/>
+  </w:num>
+  <w:num w:numId="15" w16cid:durableId="1200163644">
+    <w:abstractNumId w:val="11"/>
+  </w:num>
+  <w:num w:numId="16" w16cid:durableId="585892720">
+    <w:abstractNumId w:val="2"/>
+  </w:num>
+  <w:num w:numId="17" w16cid:durableId="621616984">
+    <w:abstractNumId w:val="10"/>
+  </w:num>
+  <w:num w:numId="18" w16cid:durableId="97991722">
+    <w:abstractNumId w:val="19"/>
+  </w:num>
+  <w:num w:numId="19" w16cid:durableId="1943762719">
+    <w:abstractNumId w:val="12"/>
+  </w:num>
+  <w:num w:numId="20" w16cid:durableId="2005935373">
+    <w:abstractNumId w:val="7"/>
+  </w:num>
+  <w:num w:numId="21" w16cid:durableId="1968462390">
+    <w:abstractNumId w:val="14"/>
+  </w:num>
+  <w:num w:numId="22" w16cid:durableId="1663510949">
+    <w:abstractNumId w:val="26"/>
+  </w:num>
+  <w:num w:numId="23" w16cid:durableId="1849589328">
+    <w:abstractNumId w:val="16"/>
+  </w:num>
+  <w:num w:numId="24" w16cid:durableId="715661819">
     <w:abstractNumId w:val="13"/>
   </w:num>
-  <w:num w:numId="4" w16cid:durableId="1610504365">
-    <w:abstractNumId w:val="20"/>
+  <w:num w:numId="25" w16cid:durableId="842091165">
+    <w:abstractNumId w:val="25"/>
   </w:num>
-  <w:num w:numId="5" w16cid:durableId="630333050">
-    <w:abstractNumId w:val="4"/>
-  </w:num>
-  <w:num w:numId="6" w16cid:durableId="924647596">
-    <w:abstractNumId w:val="16"/>
-  </w:num>
-  <w:num w:numId="7" w16cid:durableId="502210155">
-    <w:abstractNumId w:val="2"/>
-  </w:num>
-  <w:num w:numId="8" w16cid:durableId="798911664">
-    <w:abstractNumId w:val="3"/>
-  </w:num>
-  <w:num w:numId="9" w16cid:durableId="337194705">
-    <w:abstractNumId w:val="7"/>
-  </w:num>
-  <w:num w:numId="10" w16cid:durableId="401147243">
-    <w:abstractNumId w:val="6"/>
-  </w:num>
-  <w:num w:numId="11" w16cid:durableId="1199078558">
+  <w:num w:numId="26" w16cid:durableId="1738627417">
     <w:abstractNumId w:val="1"/>
   </w:num>
-  <w:num w:numId="12" w16cid:durableId="520751226">
-    <w:abstractNumId w:val="19"/>
-  </w:num>
-  <w:num w:numId="13" w16cid:durableId="1870873736">
-    <w:abstractNumId w:val="18"/>
-  </w:num>
-  <w:num w:numId="14" w16cid:durableId="2113938710">
-    <w:abstractNumId w:val="22"/>
-  </w:num>
-  <w:num w:numId="15" w16cid:durableId="1200163644">
-    <w:abstractNumId w:val="9"/>
-  </w:num>
-  <w:num w:numId="16" w16cid:durableId="585892720">
+  <w:num w:numId="27" w16cid:durableId="265504118">
     <w:abstractNumId w:val="0"/>
-  </w:num>
-  <w:num w:numId="17" w16cid:durableId="621616984">
-    <w:abstractNumId w:val="8"/>
-  </w:num>
-  <w:num w:numId="18" w16cid:durableId="97991722">
-    <w:abstractNumId w:val="17"/>
-  </w:num>
-  <w:num w:numId="19" w16cid:durableId="1943762719">
-    <w:abstractNumId w:val="10"/>
-  </w:num>
-  <w:num w:numId="20" w16cid:durableId="2005935373">
-    <w:abstractNumId w:val="5"/>
-  </w:num>
-  <w:num w:numId="21" w16cid:durableId="1968462390">
-    <w:abstractNumId w:val="12"/>
-  </w:num>
-  <w:num w:numId="22" w16cid:durableId="1663510949">
-    <w:abstractNumId w:val="24"/>
-  </w:num>
-  <w:num w:numId="23" w16cid:durableId="1849589328">
-    <w:abstractNumId w:val="14"/>
-  </w:num>
-  <w:num w:numId="24" w16cid:durableId="715661819">
-    <w:abstractNumId w:val="11"/>
-  </w:num>
-  <w:num w:numId="25" w16cid:durableId="842091165">
-    <w:abstractNumId w:val="23"/>
   </w:num>
 </w:numbering>
 </file>
@@ -5982,7 +7750,7 @@
   <w:style w:type="paragraph" w:default="1" w:styleId="Normal">
     <w:name w:val="Normal"/>
     <w:qFormat/>
-    <w:rsid w:val="00DC6433"/>
+    <w:rsid w:val="00187246"/>
     <w:pPr>
       <w:spacing w:after="120" w:line="259" w:lineRule="auto"/>
       <w:ind w:left="10" w:hanging="10"/>
@@ -6039,10 +7807,32 @@
       <w:szCs w:val="27"/>
     </w:rPr>
   </w:style>
+  <w:style w:type="paragraph" w:styleId="Heading4">
+    <w:name w:val="heading 4"/>
+    <w:basedOn w:val="Normal"/>
+    <w:next w:val="Normal"/>
+    <w:link w:val="Heading4Char"/>
+    <w:uiPriority w:val="9"/>
+    <w:semiHidden/>
+    <w:unhideWhenUsed/>
+    <w:qFormat/>
+    <w:rsid w:val="0049073F"/>
+    <w:pPr>
+      <w:keepNext/>
+      <w:keepLines/>
+      <w:spacing w:before="40" w:after="0"/>
+      <w:outlineLvl w:val="3"/>
+    </w:pPr>
+    <w:rPr>
+      <w:rFonts w:asciiTheme="majorHAnsi" w:eastAsiaTheme="majorEastAsia" w:hAnsiTheme="majorHAnsi" w:cstheme="majorBidi"/>
+      <w:i/>
+      <w:iCs/>
+      <w:color w:val="365F91" w:themeColor="accent1" w:themeShade="BF"/>
+    </w:rPr>
+  </w:style>
   <w:style w:type="character" w:default="1" w:styleId="DefaultParagraphFont">
     <w:name w:val="Default Paragraph Font"/>
     <w:uiPriority w:val="1"/>
-    <w:semiHidden/>
     <w:unhideWhenUsed/>
   </w:style>
   <w:style w:type="table" w:default="1" w:styleId="TableNormal">
@@ -6341,6 +8131,22 @@
       <w:lang w:eastAsia="en-IN"/>
     </w:rPr>
   </w:style>
+  <w:style w:type="character" w:customStyle="1" w:styleId="Heading4Char">
+    <w:name w:val="Heading 4 Char"/>
+    <w:basedOn w:val="DefaultParagraphFont"/>
+    <w:link w:val="Heading4"/>
+    <w:uiPriority w:val="9"/>
+    <w:semiHidden/>
+    <w:rsid w:val="0049073F"/>
+    <w:rPr>
+      <w:rFonts w:asciiTheme="majorHAnsi" w:eastAsiaTheme="majorEastAsia" w:hAnsiTheme="majorHAnsi" w:cstheme="majorBidi"/>
+      <w:i/>
+      <w:iCs/>
+      <w:color w:val="365F91" w:themeColor="accent1" w:themeShade="BF"/>
+      <w:sz w:val="24"/>
+      <w:lang w:eastAsia="en-IN"/>
+    </w:rPr>
+  </w:style>
 </w:styles>
 </file>
 
@@ -6384,19 +8190,19 @@
 
 <file path=word/glossary/fontTable.xml><?xml version="1.0" encoding="utf-8"?>
 <w:fonts xmlns:mc="http://schemas.openxmlformats.org/markup-compatibility/2006" xmlns:r="http://schemas.openxmlformats.org/officeDocument/2006/relationships" xmlns:w="http://schemas.openxmlformats.org/wordprocessingml/2006/main" xmlns:w14="http://schemas.microsoft.com/office/word/2010/wordml" xmlns:w15="http://schemas.microsoft.com/office/word/2012/wordml" xmlns:w16cex="http://schemas.microsoft.com/office/word/2018/wordml/cex" xmlns:w16cid="http://schemas.microsoft.com/office/word/2016/wordml/cid" xmlns:w16="http://schemas.microsoft.com/office/word/2018/wordml" xmlns:w16du="http://schemas.microsoft.com/office/word/2023/wordml/word16du" xmlns:w16sdtdh="http://schemas.microsoft.com/office/word/2020/wordml/sdtdatahash" xmlns:w16sdtfl="http://schemas.microsoft.com/office/word/2024/wordml/sdtformatlock" xmlns:w16se="http://schemas.microsoft.com/office/word/2015/wordml/symex" mc:Ignorable="w14 w15 w16se w16cid w16 w16cex w16sdtdh w16sdtfl w16du">
+  <w:font w:name="Times New Roman">
+    <w:panose1 w:val="02020603050405020304"/>
+    <w:charset w:val="00"/>
+    <w:family w:val="roman"/>
+    <w:pitch w:val="variable"/>
+    <w:sig w:usb0="E0002EFF" w:usb1="C000785B" w:usb2="00000009" w:usb3="00000000" w:csb0="000001FF" w:csb1="00000000"/>
+  </w:font>
   <w:font w:name="Symbol">
     <w:panose1 w:val="05050102010706020507"/>
     <w:charset w:val="02"/>
     <w:family w:val="roman"/>
     <w:pitch w:val="variable"/>
     <w:sig w:usb0="00000000" w:usb1="10000000" w:usb2="00000000" w:usb3="00000000" w:csb0="80000000" w:csb1="00000000"/>
-  </w:font>
-  <w:font w:name="Times New Roman">
-    <w:panose1 w:val="02020603050405020304"/>
-    <w:charset w:val="00"/>
-    <w:family w:val="roman"/>
-    <w:pitch w:val="variable"/>
-    <w:sig w:usb0="E0002EFF" w:usb1="C000785B" w:usb2="00000009" w:usb3="00000000" w:csb0="000001FF" w:csb1="00000000"/>
   </w:font>
   <w:font w:name="Courier New">
     <w:panose1 w:val="02070309020205020404"/>
@@ -6469,6 +8275,7 @@
     <w:rsid w:val="005B7268"/>
     <w:rsid w:val="005E5E30"/>
     <w:rsid w:val="00672B09"/>
+    <w:rsid w:val="006A313F"/>
     <w:rsid w:val="00735F32"/>
     <w:rsid w:val="0074336B"/>
     <w:rsid w:val="00743EAE"/>
@@ -6488,6 +8295,7 @@
     <w:rsid w:val="00C43A35"/>
     <w:rsid w:val="00CA635B"/>
     <w:rsid w:val="00CB099D"/>
+    <w:rsid w:val="00CB0D80"/>
     <w:rsid w:val="00CC6E5D"/>
     <w:rsid w:val="00E46158"/>
     <w:rsid w:val="00E7176C"/>

</xml_diff>